<commit_message>
[scholar] study pack: links from this week's four readings to earlier modules
Co-Authored-By: Claude Opus 5.5 <noreply@anthropic.com>
Claude-Session: https://claude.ai/code/session_019uQWfMoV11me5yJ6LYRtPv
</commit_message>
<xml_diff>
--- a/dba/coursework/GEB7365_International_Business/READINGS_NONMARKET_STUDY_PACK.docx
+++ b/dba/coursework/GEB7365_International_Business/READINGS_NONMARKET_STUDY_PACK.docx
@@ -3306,6 +3306,1004 @@
           <w:color w:val="000000"/>
           <w:sz w:val="24"/>
         </w:rPr>
+        <w:t>How these connect to earlier readings in the course</w:t>
+      </w:r>
+    </w:p>
+    <w:tbl>
+      <w:tblPr>
+        <w:tblStyle w:val="TableGrid"/>
+        <w:tblW w:type="auto" w:w="0"/>
+        <w:tblLook w:firstColumn="1" w:firstRow="1" w:lastColumn="0" w:lastRow="0" w:noHBand="0" w:noVBand="1" w:val="04A0"/>
+      </w:tblPr>
+      <w:tblGrid>
+        <w:gridCol w:w="3120"/>
+        <w:gridCol w:w="3120"/>
+        <w:gridCol w:w="3120"/>
+      </w:tblGrid>
+      <w:tr>
+        <w:tc>
+          <w:tcPr>
+            <w:tcW w:type="dxa" w:w="3120"/>
+          </w:tcPr>
+          <w:p>
+            <w:pPr>
+              <w:spacing w:after="40" w:line="240" w:lineRule="auto"/>
+            </w:pPr>
+            <w:r>
+              <w:rPr>
+                <w:rFonts w:ascii="Times New Roman" w:hAnsi="Times New Roman" w:cs="Times New Roman" w:eastAsia="Times New Roman"/>
+                <w:b/>
+                <w:color w:val="000000"/>
+                <w:sz w:val="19"/>
+              </w:rPr>
+              <w:t>This week</w:t>
+            </w:r>
+          </w:p>
+        </w:tc>
+        <w:tc>
+          <w:tcPr>
+            <w:tcW w:type="dxa" w:w="3120"/>
+          </w:tcPr>
+          <w:p>
+            <w:pPr>
+              <w:spacing w:after="40" w:line="240" w:lineRule="auto"/>
+            </w:pPr>
+            <w:r>
+              <w:rPr>
+                <w:rFonts w:ascii="Times New Roman" w:hAnsi="Times New Roman" w:cs="Times New Roman" w:eastAsia="Times New Roman"/>
+                <w:b/>
+                <w:color w:val="000000"/>
+                <w:sz w:val="19"/>
+              </w:rPr>
+              <w:t>Connects to (earlier module)</w:t>
+            </w:r>
+          </w:p>
+        </w:tc>
+        <w:tc>
+          <w:tcPr>
+            <w:tcW w:type="dxa" w:w="3120"/>
+          </w:tcPr>
+          <w:p>
+            <w:pPr>
+              <w:spacing w:after="40" w:line="240" w:lineRule="auto"/>
+            </w:pPr>
+            <w:r>
+              <w:rPr>
+                <w:rFonts w:ascii="Times New Roman" w:hAnsi="Times New Roman" w:cs="Times New Roman" w:eastAsia="Times New Roman"/>
+                <w:b/>
+                <w:color w:val="000000"/>
+                <w:sz w:val="19"/>
+              </w:rPr>
+              <w:t>The link</w:t>
+            </w:r>
+          </w:p>
+        </w:tc>
+      </w:tr>
+      <w:tr>
+        <w:tc>
+          <w:tcPr>
+            <w:tcW w:type="dxa" w:w="3120"/>
+          </w:tcPr>
+          <w:p>
+            <w:pPr>
+              <w:spacing w:after="40" w:line="240" w:lineRule="auto"/>
+            </w:pPr>
+            <w:r>
+              <w:rPr>
+                <w:rFonts w:ascii="Times New Roman" w:hAnsi="Times New Roman" w:cs="Times New Roman" w:eastAsia="Times New Roman"/>
+                <w:b w:val="0"/>
+                <w:color w:val="000000"/>
+                <w:sz w:val="19"/>
+              </w:rPr>
+              <w:t>**Caprar** (countercultural practices)</w:t>
+            </w:r>
+          </w:p>
+        </w:tc>
+        <w:tc>
+          <w:tcPr>
+            <w:tcW w:type="dxa" w:w="3120"/>
+          </w:tcPr>
+          <w:p>
+            <w:pPr>
+              <w:spacing w:after="40" w:line="240" w:lineRule="auto"/>
+            </w:pPr>
+            <w:r>
+              <w:rPr>
+                <w:rFonts w:ascii="Times New Roman" w:hAnsi="Times New Roman" w:cs="Times New Roman" w:eastAsia="Times New Roman"/>
+                <w:b w:val="0"/>
+                <w:color w:val="000000"/>
+                <w:sz w:val="19"/>
+              </w:rPr>
+              <w:t>Mezias 2002 (Module 1)</w:t>
+            </w:r>
+          </w:p>
+        </w:tc>
+        <w:tc>
+          <w:tcPr>
+            <w:tcW w:type="dxa" w:w="3120"/>
+          </w:tcPr>
+          <w:p>
+            <w:pPr>
+              <w:spacing w:after="40" w:line="240" w:lineRule="auto"/>
+            </w:pPr>
+            <w:r>
+              <w:rPr>
+                <w:rFonts w:ascii="Times New Roman" w:hAnsi="Times New Roman" w:cs="Times New Roman" w:eastAsia="Times New Roman"/>
+                <w:b w:val="0"/>
+                <w:color w:val="000000"/>
+                <w:sz w:val="19"/>
+              </w:rPr>
+              <w:t>Liability of foreignness flips into Caprar's *advantage of foreignness*</w:t>
+            </w:r>
+          </w:p>
+        </w:tc>
+      </w:tr>
+      <w:tr>
+        <w:tc>
+          <w:tcPr>
+            <w:tcW w:type="dxa" w:w="3120"/>
+          </w:tcPr>
+          <w:p>
+            <w:pPr>
+              <w:spacing w:after="40" w:line="240" w:lineRule="auto"/>
+            </w:pPr>
+            <w:r>
+              <w:rPr>
+                <w:rFonts w:ascii="Times New Roman" w:hAnsi="Times New Roman" w:cs="Times New Roman" w:eastAsia="Times New Roman"/>
+                <w:b w:val="0"/>
+                <w:color w:val="000000"/>
+                <w:sz w:val="19"/>
+              </w:rPr>
+            </w:r>
+          </w:p>
+        </w:tc>
+        <w:tc>
+          <w:tcPr>
+            <w:tcW w:type="dxa" w:w="3120"/>
+          </w:tcPr>
+          <w:p>
+            <w:pPr>
+              <w:spacing w:after="40" w:line="240" w:lineRule="auto"/>
+            </w:pPr>
+            <w:r>
+              <w:rPr>
+                <w:rFonts w:ascii="Times New Roman" w:hAnsi="Times New Roman" w:cs="Times New Roman" w:eastAsia="Times New Roman"/>
+                <w:b w:val="0"/>
+                <w:color w:val="000000"/>
+                <w:sz w:val="19"/>
+              </w:rPr>
+              <w:t>Newburry, Gardberg &amp; Sanchez 2014 (Module 7)</w:t>
+            </w:r>
+          </w:p>
+        </w:tc>
+        <w:tc>
+          <w:tcPr>
+            <w:tcW w:type="dxa" w:w="3120"/>
+          </w:tcPr>
+          <w:p>
+            <w:pPr>
+              <w:spacing w:after="40" w:line="240" w:lineRule="auto"/>
+            </w:pPr>
+            <w:r>
+              <w:rPr>
+                <w:rFonts w:ascii="Times New Roman" w:hAnsi="Times New Roman" w:cs="Times New Roman" w:eastAsia="Times New Roman"/>
+                <w:b w:val="0"/>
+                <w:color w:val="000000"/>
+                <w:sz w:val="19"/>
+              </w:rPr>
+              <w:t>Foreign firms as more attractive employers in Latin America: foreignness as an advantage, Newburry's own evidence for Caprar's point</w:t>
+            </w:r>
+          </w:p>
+        </w:tc>
+      </w:tr>
+      <w:tr>
+        <w:tc>
+          <w:tcPr>
+            <w:tcW w:type="dxa" w:w="3120"/>
+          </w:tcPr>
+          <w:p>
+            <w:pPr>
+              <w:spacing w:after="40" w:line="240" w:lineRule="auto"/>
+            </w:pPr>
+            <w:r>
+              <w:rPr>
+                <w:rFonts w:ascii="Times New Roman" w:hAnsi="Times New Roman" w:cs="Times New Roman" w:eastAsia="Times New Roman"/>
+                <w:b w:val="0"/>
+                <w:color w:val="000000"/>
+                <w:sz w:val="19"/>
+              </w:rPr>
+            </w:r>
+          </w:p>
+        </w:tc>
+        <w:tc>
+          <w:tcPr>
+            <w:tcW w:type="dxa" w:w="3120"/>
+          </w:tcPr>
+          <w:p>
+            <w:pPr>
+              <w:spacing w:after="40" w:line="240" w:lineRule="auto"/>
+            </w:pPr>
+            <w:r>
+              <w:rPr>
+                <w:rFonts w:ascii="Times New Roman" w:hAnsi="Times New Roman" w:cs="Times New Roman" w:eastAsia="Times New Roman"/>
+                <w:b w:val="0"/>
+                <w:color w:val="000000"/>
+                <w:sz w:val="19"/>
+              </w:rPr>
+              <w:t>House et al. 2002, GLOBE (Module 5)</w:t>
+            </w:r>
+          </w:p>
+        </w:tc>
+        <w:tc>
+          <w:tcPr>
+            <w:tcW w:type="dxa" w:w="3120"/>
+          </w:tcPr>
+          <w:p>
+            <w:pPr>
+              <w:spacing w:after="40" w:line="240" w:lineRule="auto"/>
+            </w:pPr>
+            <w:r>
+              <w:rPr>
+                <w:rFonts w:ascii="Times New Roman" w:hAnsi="Times New Roman" w:cs="Times New Roman" w:eastAsia="Times New Roman"/>
+                <w:b w:val="0"/>
+                <w:color w:val="000000"/>
+                <w:sz w:val="19"/>
+              </w:rPr>
+              <w:t>GLOBE's "as is" versus "should be" values are exactly the gap Caprar uses to explain why misfit can work</w:t>
+            </w:r>
+          </w:p>
+        </w:tc>
+      </w:tr>
+      <w:tr>
+        <w:tc>
+          <w:tcPr>
+            <w:tcW w:type="dxa" w:w="3120"/>
+          </w:tcPr>
+          <w:p>
+            <w:pPr>
+              <w:spacing w:after="40" w:line="240" w:lineRule="auto"/>
+            </w:pPr>
+            <w:r>
+              <w:rPr>
+                <w:rFonts w:ascii="Times New Roman" w:hAnsi="Times New Roman" w:cs="Times New Roman" w:eastAsia="Times New Roman"/>
+                <w:b w:val="0"/>
+                <w:color w:val="000000"/>
+                <w:sz w:val="19"/>
+              </w:rPr>
+            </w:r>
+          </w:p>
+        </w:tc>
+        <w:tc>
+          <w:tcPr>
+            <w:tcW w:type="dxa" w:w="3120"/>
+          </w:tcPr>
+          <w:p>
+            <w:pPr>
+              <w:spacing w:after="40" w:line="240" w:lineRule="auto"/>
+            </w:pPr>
+            <w:r>
+              <w:rPr>
+                <w:rFonts w:ascii="Times New Roman" w:hAnsi="Times New Roman" w:cs="Times New Roman" w:eastAsia="Times New Roman"/>
+                <w:b w:val="0"/>
+                <w:color w:val="000000"/>
+                <w:sz w:val="19"/>
+              </w:rPr>
+              <w:t>Ghemawat 2001 (Module 1)</w:t>
+            </w:r>
+          </w:p>
+        </w:tc>
+        <w:tc>
+          <w:tcPr>
+            <w:tcW w:type="dxa" w:w="3120"/>
+          </w:tcPr>
+          <w:p>
+            <w:pPr>
+              <w:spacing w:after="40" w:line="240" w:lineRule="auto"/>
+            </w:pPr>
+            <w:r>
+              <w:rPr>
+                <w:rFonts w:ascii="Times New Roman" w:hAnsi="Times New Roman" w:cs="Times New Roman" w:eastAsia="Times New Roman"/>
+                <w:b w:val="0"/>
+                <w:color w:val="000000"/>
+                <w:sz w:val="19"/>
+              </w:rPr>
+              <w:t>Distance as a cost; Caprar shows the cost is not automatic</w:t>
+            </w:r>
+          </w:p>
+        </w:tc>
+      </w:tr>
+      <w:tr>
+        <w:tc>
+          <w:tcPr>
+            <w:tcW w:type="dxa" w:w="3120"/>
+          </w:tcPr>
+          <w:p>
+            <w:pPr>
+              <w:spacing w:after="40" w:line="240" w:lineRule="auto"/>
+            </w:pPr>
+            <w:r>
+              <w:rPr>
+                <w:rFonts w:ascii="Times New Roman" w:hAnsi="Times New Roman" w:cs="Times New Roman" w:eastAsia="Times New Roman"/>
+                <w:b w:val="0"/>
+                <w:color w:val="000000"/>
+                <w:sz w:val="19"/>
+              </w:rPr>
+              <w:t>**Bruijn** (civil society)</w:t>
+            </w:r>
+          </w:p>
+        </w:tc>
+        <w:tc>
+          <w:tcPr>
+            <w:tcW w:type="dxa" w:w="3120"/>
+          </w:tcPr>
+          <w:p>
+            <w:pPr>
+              <w:spacing w:after="40" w:line="240" w:lineRule="auto"/>
+            </w:pPr>
+            <w:r>
+              <w:rPr>
+                <w:rFonts w:ascii="Times New Roman" w:hAnsi="Times New Roman" w:cs="Times New Roman" w:eastAsia="Times New Roman"/>
+                <w:b w:val="0"/>
+                <w:color w:val="000000"/>
+                <w:sz w:val="19"/>
+              </w:rPr>
+              <w:t>Deephouse, Newburry &amp; Soleimani 2016 (Module 5)</w:t>
+            </w:r>
+          </w:p>
+        </w:tc>
+        <w:tc>
+          <w:tcPr>
+            <w:tcW w:type="dxa" w:w="3120"/>
+          </w:tcPr>
+          <w:p>
+            <w:pPr>
+              <w:spacing w:after="40" w:line="240" w:lineRule="auto"/>
+            </w:pPr>
+            <w:r>
+              <w:rPr>
+                <w:rFonts w:ascii="Times New Roman" w:hAnsi="Times New Roman" w:cs="Times New Roman" w:eastAsia="Times New Roman"/>
+                <w:b w:val="0"/>
+                <w:color w:val="000000"/>
+                <w:sz w:val="19"/>
+              </w:rPr>
+              <w:t>Reputation and legitimacy across national contexts; civil society is one of the audiences that confers it</w:t>
+            </w:r>
+          </w:p>
+        </w:tc>
+      </w:tr>
+      <w:tr>
+        <w:tc>
+          <w:tcPr>
+            <w:tcW w:type="dxa" w:w="3120"/>
+          </w:tcPr>
+          <w:p>
+            <w:pPr>
+              <w:spacing w:after="40" w:line="240" w:lineRule="auto"/>
+            </w:pPr>
+            <w:r>
+              <w:rPr>
+                <w:rFonts w:ascii="Times New Roman" w:hAnsi="Times New Roman" w:cs="Times New Roman" w:eastAsia="Times New Roman"/>
+                <w:b w:val="0"/>
+                <w:color w:val="000000"/>
+                <w:sz w:val="19"/>
+              </w:rPr>
+            </w:r>
+          </w:p>
+        </w:tc>
+        <w:tc>
+          <w:tcPr>
+            <w:tcW w:type="dxa" w:w="3120"/>
+          </w:tcPr>
+          <w:p>
+            <w:pPr>
+              <w:spacing w:after="40" w:line="240" w:lineRule="auto"/>
+            </w:pPr>
+            <w:r>
+              <w:rPr>
+                <w:rFonts w:ascii="Times New Roman" w:hAnsi="Times New Roman" w:cs="Times New Roman" w:eastAsia="Times New Roman"/>
+                <w:b w:val="0"/>
+                <w:color w:val="000000"/>
+                <w:sz w:val="19"/>
+              </w:rPr>
+              <w:t>Luo, Zhang &amp; Bu 2019 (Module 6)</w:t>
+            </w:r>
+          </w:p>
+        </w:tc>
+        <w:tc>
+          <w:tcPr>
+            <w:tcW w:type="dxa" w:w="3120"/>
+          </w:tcPr>
+          <w:p>
+            <w:pPr>
+              <w:spacing w:after="40" w:line="240" w:lineRule="auto"/>
+            </w:pPr>
+            <w:r>
+              <w:rPr>
+                <w:rFonts w:ascii="Times New Roman" w:hAnsi="Times New Roman" w:cs="Times New Roman" w:eastAsia="Times New Roman"/>
+                <w:b w:val="0"/>
+                <w:color w:val="000000"/>
+                <w:sz w:val="19"/>
+              </w:rPr>
+              <w:t>Developed-country MNEs in developing economies becoming "strategic insiders"; Bruijn's institutional resonance and social license</w:t>
+            </w:r>
+          </w:p>
+        </w:tc>
+      </w:tr>
+      <w:tr>
+        <w:tc>
+          <w:tcPr>
+            <w:tcW w:type="dxa" w:w="3120"/>
+          </w:tcPr>
+          <w:p>
+            <w:pPr>
+              <w:spacing w:after="40" w:line="240" w:lineRule="auto"/>
+            </w:pPr>
+            <w:r>
+              <w:rPr>
+                <w:rFonts w:ascii="Times New Roman" w:hAnsi="Times New Roman" w:cs="Times New Roman" w:eastAsia="Times New Roman"/>
+                <w:b w:val="0"/>
+                <w:color w:val="000000"/>
+                <w:sz w:val="19"/>
+              </w:rPr>
+            </w:r>
+          </w:p>
+        </w:tc>
+        <w:tc>
+          <w:tcPr>
+            <w:tcW w:type="dxa" w:w="3120"/>
+          </w:tcPr>
+          <w:p>
+            <w:pPr>
+              <w:spacing w:after="40" w:line="240" w:lineRule="auto"/>
+            </w:pPr>
+            <w:r>
+              <w:rPr>
+                <w:rFonts w:ascii="Times New Roman" w:hAnsi="Times New Roman" w:cs="Times New Roman" w:eastAsia="Times New Roman"/>
+                <w:b w:val="0"/>
+                <w:color w:val="000000"/>
+                <w:sz w:val="19"/>
+              </w:rPr>
+              <w:t>Rugman &amp; Verbeke 2004; Lopez, Kundu &amp; Ciravegna 2009 (Module 4)</w:t>
+            </w:r>
+          </w:p>
+        </w:tc>
+        <w:tc>
+          <w:tcPr>
+            <w:tcW w:type="dxa" w:w="3120"/>
+          </w:tcPr>
+          <w:p>
+            <w:pPr>
+              <w:spacing w:after="40" w:line="240" w:lineRule="auto"/>
+            </w:pPr>
+            <w:r>
+              <w:rPr>
+                <w:rFonts w:ascii="Times New Roman" w:hAnsi="Times New Roman" w:cs="Times New Roman" w:eastAsia="Times New Roman"/>
+                <w:b w:val="0"/>
+                <w:color w:val="000000"/>
+                <w:sz w:val="19"/>
+              </w:rPr>
+              <w:t>Bruijn's GDELT check is the same move: compare where research looks with where activity actually is</w:t>
+            </w:r>
+          </w:p>
+        </w:tc>
+      </w:tr>
+      <w:tr>
+        <w:tc>
+          <w:tcPr>
+            <w:tcW w:type="dxa" w:w="3120"/>
+          </w:tcPr>
+          <w:p>
+            <w:pPr>
+              <w:spacing w:after="40" w:line="240" w:lineRule="auto"/>
+            </w:pPr>
+            <w:r>
+              <w:rPr>
+                <w:rFonts w:ascii="Times New Roman" w:hAnsi="Times New Roman" w:cs="Times New Roman" w:eastAsia="Times New Roman"/>
+                <w:b w:val="0"/>
+                <w:color w:val="000000"/>
+                <w:sz w:val="19"/>
+              </w:rPr>
+              <w:t>**Sun** (nonmarket strategy)</w:t>
+            </w:r>
+          </w:p>
+        </w:tc>
+        <w:tc>
+          <w:tcPr>
+            <w:tcW w:type="dxa" w:w="3120"/>
+          </w:tcPr>
+          <w:p>
+            <w:pPr>
+              <w:spacing w:after="40" w:line="240" w:lineRule="auto"/>
+            </w:pPr>
+            <w:r>
+              <w:rPr>
+                <w:rFonts w:ascii="Times New Roman" w:hAnsi="Times New Roman" w:cs="Times New Roman" w:eastAsia="Times New Roman"/>
+                <w:b w:val="0"/>
+                <w:color w:val="000000"/>
+                <w:sz w:val="19"/>
+              </w:rPr>
+              <w:t>Meyer, Li &amp; Schotter 2020 (Module 4)</w:t>
+            </w:r>
+          </w:p>
+        </w:tc>
+        <w:tc>
+          <w:tcPr>
+            <w:tcW w:type="dxa" w:w="3120"/>
+          </w:tcPr>
+          <w:p>
+            <w:pPr>
+              <w:spacing w:after="40" w:line="240" w:lineRule="auto"/>
+            </w:pPr>
+            <w:r>
+              <w:rPr>
+                <w:rFonts w:ascii="Times New Roman" w:hAnsi="Times New Roman" w:cs="Times New Roman" w:eastAsia="Times New Roman"/>
+                <w:b w:val="0"/>
+                <w:color w:val="000000"/>
+                <w:sz w:val="19"/>
+              </w:rPr>
+              <w:t>Levels of analysis and the subsidiary; Sun finds the subnational and HQ–subsidiary levels almost unstudied</w:t>
+            </w:r>
+          </w:p>
+        </w:tc>
+      </w:tr>
+      <w:tr>
+        <w:tc>
+          <w:tcPr>
+            <w:tcW w:type="dxa" w:w="3120"/>
+          </w:tcPr>
+          <w:p>
+            <w:pPr>
+              <w:spacing w:after="40" w:line="240" w:lineRule="auto"/>
+            </w:pPr>
+            <w:r>
+              <w:rPr>
+                <w:rFonts w:ascii="Times New Roman" w:hAnsi="Times New Roman" w:cs="Times New Roman" w:eastAsia="Times New Roman"/>
+                <w:b w:val="0"/>
+                <w:color w:val="000000"/>
+                <w:sz w:val="19"/>
+              </w:rPr>
+            </w:r>
+          </w:p>
+        </w:tc>
+        <w:tc>
+          <w:tcPr>
+            <w:tcW w:type="dxa" w:w="3120"/>
+          </w:tcPr>
+          <w:p>
+            <w:pPr>
+              <w:spacing w:after="40" w:line="240" w:lineRule="auto"/>
+            </w:pPr>
+            <w:r>
+              <w:rPr>
+                <w:rFonts w:ascii="Times New Roman" w:hAnsi="Times New Roman" w:cs="Times New Roman" w:eastAsia="Times New Roman"/>
+                <w:b w:val="0"/>
+                <w:color w:val="000000"/>
+                <w:sz w:val="19"/>
+              </w:rPr>
+              <w:t>Zeng et al. 2023 (Module 4)</w:t>
+            </w:r>
+          </w:p>
+        </w:tc>
+        <w:tc>
+          <w:tcPr>
+            <w:tcW w:type="dxa" w:w="3120"/>
+          </w:tcPr>
+          <w:p>
+            <w:pPr>
+              <w:spacing w:after="40" w:line="240" w:lineRule="auto"/>
+            </w:pPr>
+            <w:r>
+              <w:rPr>
+                <w:rFonts w:ascii="Times New Roman" w:hAnsi="Times New Roman" w:cs="Times New Roman" w:eastAsia="Times New Roman"/>
+                <w:b w:val="0"/>
+                <w:color w:val="000000"/>
+                <w:sz w:val="19"/>
+              </w:rPr>
+              <w:t>Control and coordination; Sun's integration–responsiveness and centralized versus local nonmarket strategy</w:t>
+            </w:r>
+          </w:p>
+        </w:tc>
+      </w:tr>
+      <w:tr>
+        <w:tc>
+          <w:tcPr>
+            <w:tcW w:type="dxa" w:w="3120"/>
+          </w:tcPr>
+          <w:p>
+            <w:pPr>
+              <w:spacing w:after="40" w:line="240" w:lineRule="auto"/>
+            </w:pPr>
+            <w:r>
+              <w:rPr>
+                <w:rFonts w:ascii="Times New Roman" w:hAnsi="Times New Roman" w:cs="Times New Roman" w:eastAsia="Times New Roman"/>
+                <w:b w:val="0"/>
+                <w:color w:val="000000"/>
+                <w:sz w:val="19"/>
+              </w:rPr>
+            </w:r>
+          </w:p>
+        </w:tc>
+        <w:tc>
+          <w:tcPr>
+            <w:tcW w:type="dxa" w:w="3120"/>
+          </w:tcPr>
+          <w:p>
+            <w:pPr>
+              <w:spacing w:after="40" w:line="240" w:lineRule="auto"/>
+            </w:pPr>
+            <w:r>
+              <w:rPr>
+                <w:rFonts w:ascii="Times New Roman" w:hAnsi="Times New Roman" w:cs="Times New Roman" w:eastAsia="Times New Roman"/>
+                <w:b w:val="0"/>
+                <w:color w:val="000000"/>
+                <w:sz w:val="19"/>
+              </w:rPr>
+              <w:t>Fainshmidt et al. 2018; Cuervo-Cazurra, Gaur &amp; Singh 2019 (Module 5)</w:t>
+            </w:r>
+          </w:p>
+        </w:tc>
+        <w:tc>
+          <w:tcPr>
+            <w:tcW w:type="dxa" w:w="3120"/>
+          </w:tcPr>
+          <w:p>
+            <w:pPr>
+              <w:spacing w:after="40" w:line="240" w:lineRule="auto"/>
+            </w:pPr>
+            <w:r>
+              <w:rPr>
+                <w:rFonts w:ascii="Times New Roman" w:hAnsi="Times New Roman" w:cs="Times New Roman" w:eastAsia="Times New Roman"/>
+                <w:b w:val="0"/>
+                <w:color w:val="000000"/>
+                <w:sz w:val="19"/>
+              </w:rPr>
+              <w:t>Varieties of institutional systems and pro-market institutions: the "institutional multiplicity" MNEs navigate</w:t>
+            </w:r>
+          </w:p>
+        </w:tc>
+      </w:tr>
+      <w:tr>
+        <w:tc>
+          <w:tcPr>
+            <w:tcW w:type="dxa" w:w="3120"/>
+          </w:tcPr>
+          <w:p>
+            <w:pPr>
+              <w:spacing w:after="40" w:line="240" w:lineRule="auto"/>
+            </w:pPr>
+            <w:r>
+              <w:rPr>
+                <w:rFonts w:ascii="Times New Roman" w:hAnsi="Times New Roman" w:cs="Times New Roman" w:eastAsia="Times New Roman"/>
+                <w:b w:val="0"/>
+                <w:color w:val="000000"/>
+                <w:sz w:val="19"/>
+              </w:rPr>
+            </w:r>
+          </w:p>
+        </w:tc>
+        <w:tc>
+          <w:tcPr>
+            <w:tcW w:type="dxa" w:w="3120"/>
+          </w:tcPr>
+          <w:p>
+            <w:pPr>
+              <w:spacing w:after="40" w:line="240" w:lineRule="auto"/>
+            </w:pPr>
+            <w:r>
+              <w:rPr>
+                <w:rFonts w:ascii="Times New Roman" w:hAnsi="Times New Roman" w:cs="Times New Roman" w:eastAsia="Times New Roman"/>
+                <w:b w:val="0"/>
+                <w:color w:val="000000"/>
+                <w:sz w:val="19"/>
+              </w:rPr>
+              <w:t>Cuervo-Cazurra &amp; Genc 2008; Luo &amp; Tung 2007 (Module 6)</w:t>
+            </w:r>
+          </w:p>
+        </w:tc>
+        <w:tc>
+          <w:tcPr>
+            <w:tcW w:type="dxa" w:w="3120"/>
+          </w:tcPr>
+          <w:p>
+            <w:pPr>
+              <w:spacing w:after="40" w:line="240" w:lineRule="auto"/>
+            </w:pPr>
+            <w:r>
+              <w:rPr>
+                <w:rFonts w:ascii="Times New Roman" w:hAnsi="Times New Roman" w:cs="Times New Roman" w:eastAsia="Times New Roman"/>
+                <w:b w:val="0"/>
+                <w:color w:val="000000"/>
+                <w:sz w:val="19"/>
+              </w:rPr>
+              <w:t>Political capabilities as an advantage learned in difficult home institutions</w:t>
+            </w:r>
+          </w:p>
+        </w:tc>
+      </w:tr>
+      <w:tr>
+        <w:tc>
+          <w:tcPr>
+            <w:tcW w:type="dxa" w:w="3120"/>
+          </w:tcPr>
+          <w:p>
+            <w:pPr>
+              <w:spacing w:after="40" w:line="240" w:lineRule="auto"/>
+            </w:pPr>
+            <w:r>
+              <w:rPr>
+                <w:rFonts w:ascii="Times New Roman" w:hAnsi="Times New Roman" w:cs="Times New Roman" w:eastAsia="Times New Roman"/>
+                <w:b w:val="0"/>
+                <w:color w:val="000000"/>
+                <w:sz w:val="19"/>
+              </w:rPr>
+              <w:t>**Thams** (ideology)</w:t>
+            </w:r>
+          </w:p>
+        </w:tc>
+        <w:tc>
+          <w:tcPr>
+            <w:tcW w:type="dxa" w:w="3120"/>
+          </w:tcPr>
+          <w:p>
+            <w:pPr>
+              <w:spacing w:after="40" w:line="240" w:lineRule="auto"/>
+            </w:pPr>
+            <w:r>
+              <w:rPr>
+                <w:rFonts w:ascii="Times New Roman" w:hAnsi="Times New Roman" w:cs="Times New Roman" w:eastAsia="Times New Roman"/>
+                <w:b w:val="0"/>
+                <w:color w:val="000000"/>
+                <w:sz w:val="19"/>
+              </w:rPr>
+              <w:t>Fainshmidt et al. 2018 (Module 5)</w:t>
+            </w:r>
+          </w:p>
+        </w:tc>
+        <w:tc>
+          <w:tcPr>
+            <w:tcW w:type="dxa" w:w="3120"/>
+          </w:tcPr>
+          <w:p>
+            <w:pPr>
+              <w:spacing w:after="40" w:line="240" w:lineRule="auto"/>
+            </w:pPr>
+            <w:r>
+              <w:rPr>
+                <w:rFonts w:ascii="Times New Roman" w:hAnsi="Times New Roman" w:cs="Times New Roman" w:eastAsia="Times New Roman"/>
+                <w:b w:val="0"/>
+                <w:color w:val="000000"/>
+                <w:sz w:val="19"/>
+              </w:rPr>
+              <w:t>Ideology as an informal institution layered on formal institutional systems</w:t>
+            </w:r>
+          </w:p>
+        </w:tc>
+      </w:tr>
+      <w:tr>
+        <w:tc>
+          <w:tcPr>
+            <w:tcW w:type="dxa" w:w="3120"/>
+          </w:tcPr>
+          <w:p>
+            <w:pPr>
+              <w:spacing w:after="40" w:line="240" w:lineRule="auto"/>
+            </w:pPr>
+            <w:r>
+              <w:rPr>
+                <w:rFonts w:ascii="Times New Roman" w:hAnsi="Times New Roman" w:cs="Times New Roman" w:eastAsia="Times New Roman"/>
+                <w:b w:val="0"/>
+                <w:color w:val="000000"/>
+                <w:sz w:val="19"/>
+              </w:rPr>
+            </w:r>
+          </w:p>
+        </w:tc>
+        <w:tc>
+          <w:tcPr>
+            <w:tcW w:type="dxa" w:w="3120"/>
+          </w:tcPr>
+          <w:p>
+            <w:pPr>
+              <w:spacing w:after="40" w:line="240" w:lineRule="auto"/>
+            </w:pPr>
+            <w:r>
+              <w:rPr>
+                <w:rFonts w:ascii="Times New Roman" w:hAnsi="Times New Roman" w:cs="Times New Roman" w:eastAsia="Times New Roman"/>
+                <w:b w:val="0"/>
+                <w:color w:val="000000"/>
+                <w:sz w:val="19"/>
+              </w:rPr>
+              <w:t>Cuervo-Cazurra 2012, Goldilocks; Buckley et al. 2023 (Module 7)</w:t>
+            </w:r>
+          </w:p>
+        </w:tc>
+        <w:tc>
+          <w:tcPr>
+            <w:tcW w:type="dxa" w:w="3120"/>
+          </w:tcPr>
+          <w:p>
+            <w:pPr>
+              <w:spacing w:after="40" w:line="240" w:lineRule="auto"/>
+            </w:pPr>
+            <w:r>
+              <w:rPr>
+                <w:rFonts w:ascii="Times New Roman" w:hAnsi="Times New Roman" w:cs="Times New Roman" w:eastAsia="Times New Roman"/>
+                <w:b w:val="0"/>
+                <w:color w:val="000000"/>
+                <w:sz w:val="19"/>
+              </w:rPr>
+              <w:t>Whether IB needs new theory or extended theory; Thams extends existing theories one by one and calls for interdisciplinary work</w:t>
+            </w:r>
+          </w:p>
+        </w:tc>
+      </w:tr>
+      <w:tr>
+        <w:tc>
+          <w:tcPr>
+            <w:tcW w:type="dxa" w:w="3120"/>
+          </w:tcPr>
+          <w:p>
+            <w:pPr>
+              <w:spacing w:after="40" w:line="240" w:lineRule="auto"/>
+            </w:pPr>
+            <w:r>
+              <w:rPr>
+                <w:rFonts w:ascii="Times New Roman" w:hAnsi="Times New Roman" w:cs="Times New Roman" w:eastAsia="Times New Roman"/>
+                <w:b w:val="0"/>
+                <w:color w:val="000000"/>
+                <w:sz w:val="19"/>
+              </w:rPr>
+            </w:r>
+          </w:p>
+        </w:tc>
+        <w:tc>
+          <w:tcPr>
+            <w:tcW w:type="dxa" w:w="3120"/>
+          </w:tcPr>
+          <w:p>
+            <w:pPr>
+              <w:spacing w:after="40" w:line="240" w:lineRule="auto"/>
+            </w:pPr>
+            <w:r>
+              <w:rPr>
+                <w:rFonts w:ascii="Times New Roman" w:hAnsi="Times New Roman" w:cs="Times New Roman" w:eastAsia="Times New Roman"/>
+                <w:b w:val="0"/>
+                <w:color w:val="000000"/>
+                <w:sz w:val="19"/>
+              </w:rPr>
+              <w:t>Geleilate et al. 2016 (Module 7)</w:t>
+            </w:r>
+          </w:p>
+        </w:tc>
+        <w:tc>
+          <w:tcPr>
+            <w:tcW w:type="dxa" w:w="3120"/>
+          </w:tcPr>
+          <w:p>
+            <w:pPr>
+              <w:spacing w:after="40" w:line="240" w:lineRule="auto"/>
+            </w:pPr>
+            <w:r>
+              <w:rPr>
+                <w:rFonts w:ascii="Times New Roman" w:hAnsi="Times New Roman" w:cs="Times New Roman" w:eastAsia="Times New Roman"/>
+                <w:b w:val="0"/>
+                <w:color w:val="000000"/>
+                <w:sz w:val="19"/>
+              </w:rPr>
+              <w:t>Home-country institutions shape outcomes differently for emerging and developed MNEs; Thams adds home-country ideology</w:t>
+            </w:r>
+          </w:p>
+        </w:tc>
+      </w:tr>
+      <w:tr>
+        <w:tc>
+          <w:tcPr>
+            <w:tcW w:type="dxa" w:w="3120"/>
+          </w:tcPr>
+          <w:p>
+            <w:pPr>
+              <w:spacing w:after="40" w:line="240" w:lineRule="auto"/>
+            </w:pPr>
+            <w:r>
+              <w:rPr>
+                <w:rFonts w:ascii="Times New Roman" w:hAnsi="Times New Roman" w:cs="Times New Roman" w:eastAsia="Times New Roman"/>
+                <w:b w:val="0"/>
+                <w:color w:val="000000"/>
+                <w:sz w:val="19"/>
+              </w:rPr>
+            </w:r>
+          </w:p>
+        </w:tc>
+        <w:tc>
+          <w:tcPr>
+            <w:tcW w:type="dxa" w:w="3120"/>
+          </w:tcPr>
+          <w:p>
+            <w:pPr>
+              <w:spacing w:after="40" w:line="240" w:lineRule="auto"/>
+            </w:pPr>
+            <w:r>
+              <w:rPr>
+                <w:rFonts w:ascii="Times New Roman" w:hAnsi="Times New Roman" w:cs="Times New Roman" w:eastAsia="Times New Roman"/>
+                <w:b w:val="0"/>
+                <w:color w:val="000000"/>
+                <w:sz w:val="19"/>
+              </w:rPr>
+              <w:t>Newburry &amp; Yakova 2006 (cited in your AIB paper)</w:t>
+            </w:r>
+          </w:p>
+        </w:tc>
+        <w:tc>
+          <w:tcPr>
+            <w:tcW w:type="dxa" w:w="3120"/>
+          </w:tcPr>
+          <w:p>
+            <w:pPr>
+              <w:spacing w:after="40" w:line="240" w:lineRule="auto"/>
+            </w:pPr>
+            <w:r>
+              <w:rPr>
+                <w:rFonts w:ascii="Times New Roman" w:hAnsi="Times New Roman" w:cs="Times New Roman" w:eastAsia="Times New Roman"/>
+                <w:b w:val="0"/>
+                <w:color w:val="000000"/>
+                <w:sz w:val="19"/>
+              </w:rPr>
+              <w:t>Culture shapes preferences for standardization; Thams makes the same multi-level argument for ideology</w:t>
+            </w:r>
+          </w:p>
+        </w:tc>
+      </w:tr>
+    </w:tbl>
+    <w:p>
+      <w:pPr>
+        <w:spacing w:after="120"/>
+      </w:pPr>
+    </w:p>
+    <w:p>
+      <w:pPr>
+        <w:spacing w:line="276" w:lineRule="auto" w:after="160"/>
+        <w:jc w:val="both"/>
+      </w:pPr>
+      <w:r>
+        <w:rPr>
+          <w:rFonts w:ascii="Times New Roman" w:hAnsi="Times New Roman" w:cs="Times New Roman" w:eastAsia="Times New Roman"/>
+          <w:b/>
+          <w:i w:val="0"/>
+          <w:color w:val="000000"/>
+          <w:sz w:val="22"/>
+        </w:rPr>
+        <w:t>The one-sentence version for class:</w:t>
+      </w:r>
+      <w:r>
+        <w:rPr>
+          <w:rFonts w:ascii="Times New Roman" w:hAnsi="Times New Roman" w:cs="Times New Roman" w:eastAsia="Times New Roman"/>
+          <w:color w:val="000000"/>
+          <w:sz w:val="22"/>
+        </w:rPr>
+        <w:t xml:space="preserve"> </w:t>
+      </w:r>
+      <w:r>
+        <w:rPr>
+          <w:rFonts w:ascii="Times New Roman" w:hAnsi="Times New Roman" w:cs="Times New Roman" w:eastAsia="Times New Roman"/>
+          <w:b w:val="0"/>
+          <w:i/>
+          <w:color w:val="000000"/>
+          <w:sz w:val="22"/>
+        </w:rPr>
+        <w:t>"Across the course we moved from where MNEs go (distance, regionalization) to how they are structured (subsidiaries, control) to the institutions they face; this module adds the actors and beliefs that are not markets at all: civil society, culture, and ideology, at every level from the supranational down to the CEO."</w:t>
+      </w:r>
+    </w:p>
+    <w:p>
+      <w:pPr>
+        <w:pStyle w:val="Heading2"/>
+      </w:pPr>
+      <w:r>
+        <w:rPr>
+          <w:rFonts w:ascii="Times New Roman" w:hAnsi="Times New Roman" w:cs="Times New Roman" w:eastAsia="Times New Roman"/>
+          <w:b/>
+          <w:color w:val="000000"/>
+          <w:sz w:val="24"/>
+        </w:rPr>
         <w:t>NotebookLM: how to load this</w:t>
       </w:r>
     </w:p>

</xml_diff>